<commit_message>
Add voice-method handout; reframe RTCF for frontier vs self-hosted models
Voice method: new companion-site handout "Make your edge persistent: the
two-page voice method" (Ethan Mollick), framed as the persistent version of
the two-pass demo's edge-injection, linking to Style Mirror
(stylemirror.eduserver.au) which can run locally. Section added to the
Frameworks page; facilitator pointer in the two-pass demo notes.

RTCF: make explicit that Role/Task/Format are scaffolding (most valuable on
weaker/self-hosted models; frontier models infer them from clear writing),
while Context is the part that always matters — the one thing only you supply.
Lands on the RTCF slide (visible beat + notes) and the prompt-library worksheet.
Chatbot knowledge refreshed (22 docs).
</commit_message>
<xml_diff>
--- a/content/slide-deck.docx
+++ b/content/slide-deck.docx
@@ -2251,7 +2251,17 @@
         <w:t xml:space="preserve"> </w:t>
       </w:r>
       <w:r>
-        <w:t xml:space="preserve">— Context (what does it need to know?)</w:t>
+        <w:t xml:space="preserve">— Context (what does it need to know?) —</w:t>
+      </w:r>
+      <w:r>
+        <w:t xml:space="preserve"> </w:t>
+      </w:r>
+      <w:r>
+        <w:rPr>
+          <w:i/>
+          <w:iCs/>
+        </w:rPr>
+        <w:t xml:space="preserve">where your edge enters</w:t>
       </w:r>
     </w:p>
     <w:p>
@@ -2278,6 +2288,40 @@
     </w:p>
     <w:p>
       <w:pPr>
+        <w:pStyle w:val="FirstParagraph"/>
+      </w:pPr>
+      <w:r>
+        <w:rPr>
+          <w:b/>
+          <w:bCs/>
+        </w:rPr>
+        <w:t xml:space="preserve">Role, Task and Format are scaffolding</w:t>
+      </w:r>
+      <w:r>
+        <w:t xml:space="preserve"> </w:t>
+      </w:r>
+      <w:r>
+        <w:t xml:space="preserve">— weaker or self-hosted models need it spelled out; a frontier model infers it from clear writing.</w:t>
+      </w:r>
+      <w:r>
+        <w:t xml:space="preserve"> </w:t>
+      </w:r>
+      <w:r>
+        <w:rPr>
+          <w:b/>
+          <w:bCs/>
+        </w:rPr>
+        <w:t xml:space="preserve">Context is the part that always matters</w:t>
+      </w:r>
+      <w:r>
+        <w:t xml:space="preserve"> </w:t>
+      </w:r>
+      <w:r>
+        <w:t xml:space="preserve">— it’s the one thing only you supply.</w:t>
+      </w:r>
+    </w:p>
+    <w:p>
+      <w:pPr>
         <w:pStyle w:val="Compact"/>
         <w:numPr>
           <w:ilvl w:val="0"/>
@@ -2297,7 +2341,67 @@
         </w:numPr>
       </w:pPr>
       <w:r>
-        <w:t xml:space="preserve">Not every prompt needs all four. But for anything important, all four transform the result.</w:t>
+        <w:t xml:space="preserve">Separate the two halves of RTCF:</w:t>
+      </w:r>
+    </w:p>
+    <w:p>
+      <w:pPr>
+        <w:pStyle w:val="Compact"/>
+        <w:numPr>
+          <w:ilvl w:val="1"/>
+          <w:numId w:val="1020"/>
+        </w:numPr>
+      </w:pPr>
+      <w:r>
+        <w:rPr>
+          <w:b/>
+          <w:bCs/>
+        </w:rPr>
+        <w:t xml:space="preserve">Scaffolding (Role, Task, Format):</w:t>
+      </w:r>
+      <w:r>
+        <w:t xml:space="preserve"> </w:t>
+      </w:r>
+      <w:r>
+        <w:t xml:space="preserve">mostly for weaker / self-hosted models that need the structure. A frontier model (Claude, GPT-4-class) follows plain, well-written instructions well — if you’re good at briefing a human, you’re most of the way there. Use the labels as a checklist, not a rigid template you must fill every time. Over-ritualising them can even make prompts worse.</w:t>
+      </w:r>
+    </w:p>
+    <w:p>
+      <w:pPr>
+        <w:pStyle w:val="Compact"/>
+        <w:numPr>
+          <w:ilvl w:val="1"/>
+          <w:numId w:val="1020"/>
+        </w:numPr>
+      </w:pPr>
+      <w:r>
+        <w:rPr>
+          <w:b/>
+          <w:bCs/>
+        </w:rPr>
+        <w:t xml:space="preserve">Context:</w:t>
+      </w:r>
+      <w:r>
+        <w:t xml:space="preserve"> </w:t>
+      </w:r>
+      <w:r>
+        <w:t xml:space="preserve">the one part that matters on</w:t>
+      </w:r>
+      <w:r>
+        <w:t xml:space="preserve"> </w:t>
+      </w:r>
+      <w:r>
+        <w:rPr>
+          <w:i/>
+          <w:iCs/>
+        </w:rPr>
+        <w:t xml:space="preserve">any</w:t>
+      </w:r>
+      <w:r>
+        <w:t xml:space="preserve"> </w:t>
+      </w:r>
+      <w:r>
+        <w:t xml:space="preserve">model, because it’s the thing only you hold — your specifics, your edge. No model, however smart, can manufacture your context.</w:t>
       </w:r>
     </w:p>
     <w:p>
@@ -2309,7 +2413,31 @@
         </w:numPr>
       </w:pPr>
       <w:r>
-        <w:t xml:space="preserve">RTCF isn’t a trick — it’s just being clear about what you actually want, which is the skill underneath all good prompting.</w:t>
+        <w:t xml:space="preserve">So the durable skill isn’t</w:t>
+      </w:r>
+      <w:r>
+        <w:t xml:space="preserve"> </w:t>
+      </w:r>
+      <w:r>
+        <w:t xml:space="preserve">“master a prompt framework.”</w:t>
+      </w:r>
+      <w:r>
+        <w:t xml:space="preserve"> </w:t>
+      </w:r>
+      <w:r>
+        <w:t xml:space="preserve">It’s the skill that already makes you good at instructing people: being clear about what you want, and supplying the context the receiver can’t infer. RTCF just names the parts — and as models get smarter, the scaffolding fades, leaving exactly your judgement and context.</w:t>
+      </w:r>
+    </w:p>
+    <w:p>
+      <w:pPr>
+        <w:pStyle w:val="Compact"/>
+        <w:numPr>
+          <w:ilvl w:val="0"/>
+          <w:numId w:val="1019"/>
+        </w:numPr>
+      </w:pPr>
+      <w:r>
+        <w:t xml:space="preserve">Honest note for the self-hosted crowd: if you run smaller local models (Ollama etc.), RTCF’s full structure earns its keep — that’s where it pays off most.</w:t>
       </w:r>
     </w:p>
     <w:p>
@@ -2476,7 +2604,7 @@
         <w:pStyle w:val="Compact"/>
         <w:numPr>
           <w:ilvl w:val="0"/>
-          <w:numId w:val="1020"/>
+          <w:numId w:val="1021"/>
         </w:numPr>
       </w:pPr>
       <w:r>
@@ -2488,7 +2616,7 @@
         <w:pStyle w:val="Compact"/>
         <w:numPr>
           <w:ilvl w:val="0"/>
-          <w:numId w:val="1020"/>
+          <w:numId w:val="1021"/>
         </w:numPr>
       </w:pPr>
       <w:r>
@@ -2608,7 +2736,7 @@
         <w:pStyle w:val="Compact"/>
         <w:numPr>
           <w:ilvl w:val="0"/>
-          <w:numId w:val="1021"/>
+          <w:numId w:val="1022"/>
         </w:numPr>
       </w:pPr>
       <w:r>
@@ -2620,7 +2748,7 @@
         <w:pStyle w:val="Compact"/>
         <w:numPr>
           <w:ilvl w:val="0"/>
-          <w:numId w:val="1021"/>
+          <w:numId w:val="1022"/>
         </w:numPr>
       </w:pPr>
       <w:r>
@@ -2654,7 +2782,7 @@
         <w:pStyle w:val="Compact"/>
         <w:numPr>
           <w:ilvl w:val="0"/>
-          <w:numId w:val="1021"/>
+          <w:numId w:val="1022"/>
         </w:numPr>
       </w:pPr>
       <w:r>
@@ -2682,7 +2810,7 @@
         <w:pStyle w:val="Compact"/>
         <w:numPr>
           <w:ilvl w:val="0"/>
-          <w:numId w:val="1021"/>
+          <w:numId w:val="1022"/>
         </w:numPr>
       </w:pPr>
       <w:r>
@@ -2694,7 +2822,7 @@
         <w:pStyle w:val="Compact"/>
         <w:numPr>
           <w:ilvl w:val="0"/>
-          <w:numId w:val="1021"/>
+          <w:numId w:val="1022"/>
         </w:numPr>
       </w:pPr>
       <w:r>
@@ -2718,7 +2846,7 @@
         <w:pStyle w:val="Compact"/>
         <w:numPr>
           <w:ilvl w:val="0"/>
-          <w:numId w:val="1021"/>
+          <w:numId w:val="1022"/>
         </w:numPr>
       </w:pPr>
       <w:r>
@@ -2736,6 +2864,42 @@
       </w:r>
       <w:r>
         <w:t xml:space="preserve">.</w:t>
+      </w:r>
+    </w:p>
+    <w:p>
+      <w:pPr>
+        <w:pStyle w:val="Compact"/>
+        <w:numPr>
+          <w:ilvl w:val="0"/>
+          <w:numId w:val="1022"/>
+        </w:numPr>
+      </w:pPr>
+      <w:r>
+        <w:t xml:space="preserve">Go deeper (companion site): the</w:t>
+      </w:r>
+      <w:r>
+        <w:t xml:space="preserve"> </w:t>
+      </w:r>
+      <w:r>
+        <w:t xml:space="preserve">“two-page voice method”</w:t>
+      </w:r>
+      <w:r>
+        <w:t xml:space="preserve"> </w:t>
+      </w:r>
+      <w:r>
+        <w:t xml:space="preserve">makes this edge persistent — give the AI a writing sample, have it produce a style brief, paste it into custom instructions. Free tool: Style Mirror (stylemirror.eduserver.au), which can run locally. Caveat to land: the result is a</w:t>
+      </w:r>
+      <w:r>
+        <w:t xml:space="preserve"> </w:t>
+      </w:r>
+      <w:r>
+        <w:t xml:space="preserve">“slight parody”</w:t>
+      </w:r>
+      <w:r>
+        <w:t xml:space="preserve"> </w:t>
+      </w:r>
+      <w:r>
+        <w:t xml:space="preserve">of you — an average of your voice — so the residual edge stays yours.</w:t>
       </w:r>
     </w:p>
     <w:p>
@@ -2888,7 +3052,7 @@
         <w:pStyle w:val="Compact"/>
         <w:numPr>
           <w:ilvl w:val="0"/>
-          <w:numId w:val="1022"/>
+          <w:numId w:val="1023"/>
         </w:numPr>
       </w:pPr>
       <w:r>
@@ -2900,7 +3064,7 @@
         <w:pStyle w:val="Compact"/>
         <w:numPr>
           <w:ilvl w:val="0"/>
-          <w:numId w:val="1022"/>
+          <w:numId w:val="1023"/>
         </w:numPr>
       </w:pPr>
       <w:r>
@@ -2922,7 +3086,7 @@
         <w:pStyle w:val="Compact"/>
         <w:numPr>
           <w:ilvl w:val="0"/>
-          <w:numId w:val="1022"/>
+          <w:numId w:val="1023"/>
         </w:numPr>
       </w:pPr>
       <w:r>
@@ -2944,7 +3108,7 @@
         <w:pStyle w:val="Compact"/>
         <w:numPr>
           <w:ilvl w:val="0"/>
-          <w:numId w:val="1022"/>
+          <w:numId w:val="1023"/>
         </w:numPr>
       </w:pPr>
       <w:r>
@@ -2978,7 +3142,7 @@
         <w:pStyle w:val="Compact"/>
         <w:numPr>
           <w:ilvl w:val="0"/>
-          <w:numId w:val="1023"/>
+          <w:numId w:val="1024"/>
         </w:numPr>
       </w:pPr>
       <w:r>
@@ -2990,7 +3154,7 @@
         <w:pStyle w:val="Compact"/>
         <w:numPr>
           <w:ilvl w:val="0"/>
-          <w:numId w:val="1023"/>
+          <w:numId w:val="1024"/>
         </w:numPr>
       </w:pPr>
       <w:r>
@@ -3008,7 +3172,7 @@
         <w:pStyle w:val="Compact"/>
         <w:numPr>
           <w:ilvl w:val="0"/>
-          <w:numId w:val="1023"/>
+          <w:numId w:val="1024"/>
         </w:numPr>
       </w:pPr>
       <w:r>
@@ -3092,7 +3256,7 @@
         <w:pStyle w:val="Compact"/>
         <w:numPr>
           <w:ilvl w:val="0"/>
-          <w:numId w:val="1024"/>
+          <w:numId w:val="1025"/>
         </w:numPr>
       </w:pPr>
       <w:r>
@@ -3130,7 +3294,7 @@
         <w:pStyle w:val="Compact"/>
         <w:numPr>
           <w:ilvl w:val="0"/>
-          <w:numId w:val="1025"/>
+          <w:numId w:val="1026"/>
         </w:numPr>
       </w:pPr>
       <w:r>
@@ -3142,7 +3306,7 @@
         <w:pStyle w:val="Compact"/>
         <w:numPr>
           <w:ilvl w:val="0"/>
-          <w:numId w:val="1025"/>
+          <w:numId w:val="1026"/>
         </w:numPr>
       </w:pPr>
       <w:r>
@@ -3207,7 +3371,7 @@
         <w:pStyle w:val="Compact"/>
         <w:numPr>
           <w:ilvl w:val="0"/>
-          <w:numId w:val="1026"/>
+          <w:numId w:val="1027"/>
         </w:numPr>
       </w:pPr>
       <w:r>
@@ -3248,7 +3412,7 @@
         <w:pStyle w:val="Compact"/>
         <w:numPr>
           <w:ilvl w:val="0"/>
-          <w:numId w:val="1026"/>
+          <w:numId w:val="1027"/>
         </w:numPr>
       </w:pPr>
       <w:r>
@@ -3341,7 +3505,7 @@
         <w:pStyle w:val="Compact"/>
         <w:numPr>
           <w:ilvl w:val="0"/>
-          <w:numId w:val="1027"/>
+          <w:numId w:val="1028"/>
         </w:numPr>
       </w:pPr>
       <w:r>
@@ -3353,7 +3517,7 @@
         <w:pStyle w:val="Compact"/>
         <w:numPr>
           <w:ilvl w:val="0"/>
-          <w:numId w:val="1027"/>
+          <w:numId w:val="1028"/>
         </w:numPr>
       </w:pPr>
       <w:r>
@@ -3572,7 +3736,7 @@
         <w:pStyle w:val="Compact"/>
         <w:numPr>
           <w:ilvl w:val="0"/>
-          <w:numId w:val="1028"/>
+          <w:numId w:val="1029"/>
         </w:numPr>
       </w:pPr>
       <w:r>
@@ -3758,7 +3922,7 @@
         <w:pStyle w:val="Compact"/>
         <w:numPr>
           <w:ilvl w:val="0"/>
-          <w:numId w:val="1029"/>
+          <w:numId w:val="1030"/>
         </w:numPr>
       </w:pPr>
       <w:r>
@@ -3770,7 +3934,7 @@
         <w:pStyle w:val="Compact"/>
         <w:numPr>
           <w:ilvl w:val="0"/>
-          <w:numId w:val="1029"/>
+          <w:numId w:val="1030"/>
         </w:numPr>
       </w:pPr>
       <w:r>
@@ -3956,7 +4120,7 @@
         <w:pStyle w:val="Compact"/>
         <w:numPr>
           <w:ilvl w:val="0"/>
-          <w:numId w:val="1030"/>
+          <w:numId w:val="1031"/>
         </w:numPr>
       </w:pPr>
       <w:r>
@@ -4126,7 +4290,7 @@
         <w:pStyle w:val="Compact"/>
         <w:numPr>
           <w:ilvl w:val="0"/>
-          <w:numId w:val="1031"/>
+          <w:numId w:val="1032"/>
         </w:numPr>
       </w:pPr>
       <w:r>
@@ -4163,7 +4327,7 @@
         <w:pStyle w:val="Compact"/>
         <w:numPr>
           <w:ilvl w:val="0"/>
-          <w:numId w:val="1031"/>
+          <w:numId w:val="1032"/>
         </w:numPr>
       </w:pPr>
       <w:r>
@@ -4349,7 +4513,7 @@
         <w:pStyle w:val="Compact"/>
         <w:numPr>
           <w:ilvl w:val="0"/>
-          <w:numId w:val="1032"/>
+          <w:numId w:val="1033"/>
         </w:numPr>
       </w:pPr>
       <w:r>
@@ -4361,7 +4525,7 @@
         <w:pStyle w:val="Compact"/>
         <w:numPr>
           <w:ilvl w:val="0"/>
-          <w:numId w:val="1032"/>
+          <w:numId w:val="1033"/>
         </w:numPr>
       </w:pPr>
       <w:r>
@@ -4435,7 +4599,7 @@
         <w:pStyle w:val="Compact"/>
         <w:numPr>
           <w:ilvl w:val="0"/>
-          <w:numId w:val="1033"/>
+          <w:numId w:val="1034"/>
         </w:numPr>
       </w:pPr>
       <w:r>
@@ -4447,7 +4611,7 @@
         <w:pStyle w:val="Compact"/>
         <w:numPr>
           <w:ilvl w:val="0"/>
-          <w:numId w:val="1033"/>
+          <w:numId w:val="1034"/>
         </w:numPr>
       </w:pPr>
       <w:r>
@@ -4537,7 +4701,7 @@
         <w:pStyle w:val="Compact"/>
         <w:numPr>
           <w:ilvl w:val="0"/>
-          <w:numId w:val="1034"/>
+          <w:numId w:val="1035"/>
         </w:numPr>
       </w:pPr>
       <w:r>
@@ -4549,7 +4713,7 @@
         <w:pStyle w:val="Compact"/>
         <w:numPr>
           <w:ilvl w:val="0"/>
-          <w:numId w:val="1034"/>
+          <w:numId w:val="1035"/>
         </w:numPr>
       </w:pPr>
       <w:r>
@@ -4668,7 +4832,7 @@
         <w:pStyle w:val="Compact"/>
         <w:numPr>
           <w:ilvl w:val="0"/>
-          <w:numId w:val="1035"/>
+          <w:numId w:val="1036"/>
         </w:numPr>
       </w:pPr>
       <w:r>
@@ -4692,7 +4856,7 @@
         <w:pStyle w:val="Compact"/>
         <w:numPr>
           <w:ilvl w:val="0"/>
-          <w:numId w:val="1035"/>
+          <w:numId w:val="1036"/>
         </w:numPr>
       </w:pPr>
       <w:r>
@@ -4776,7 +4940,7 @@
         <w:pStyle w:val="Compact"/>
         <w:numPr>
           <w:ilvl w:val="0"/>
-          <w:numId w:val="1036"/>
+          <w:numId w:val="1037"/>
         </w:numPr>
       </w:pPr>
       <w:r>
@@ -4879,7 +5043,7 @@
         <w:pStyle w:val="Compact"/>
         <w:numPr>
           <w:ilvl w:val="0"/>
-          <w:numId w:val="1037"/>
+          <w:numId w:val="1038"/>
         </w:numPr>
       </w:pPr>
       <w:r>
@@ -4891,7 +5055,7 @@
         <w:pStyle w:val="Compact"/>
         <w:numPr>
           <w:ilvl w:val="0"/>
-          <w:numId w:val="1037"/>
+          <w:numId w:val="1038"/>
         </w:numPr>
       </w:pPr>
       <w:r>
@@ -4962,7 +5126,7 @@
         <w:pStyle w:val="Compact"/>
         <w:numPr>
           <w:ilvl w:val="0"/>
-          <w:numId w:val="1038"/>
+          <w:numId w:val="1039"/>
         </w:numPr>
       </w:pPr>
       <w:r>
@@ -4986,7 +5150,7 @@
         <w:pStyle w:val="Compact"/>
         <w:numPr>
           <w:ilvl w:val="0"/>
-          <w:numId w:val="1038"/>
+          <w:numId w:val="1039"/>
         </w:numPr>
       </w:pPr>
       <w:r>
@@ -5070,7 +5234,7 @@
         <w:pStyle w:val="Compact"/>
         <w:numPr>
           <w:ilvl w:val="0"/>
-          <w:numId w:val="1039"/>
+          <w:numId w:val="1040"/>
         </w:numPr>
       </w:pPr>
       <w:r>
@@ -5092,7 +5256,7 @@
         <w:pStyle w:val="Compact"/>
         <w:numPr>
           <w:ilvl w:val="0"/>
-          <w:numId w:val="1039"/>
+          <w:numId w:val="1040"/>
         </w:numPr>
       </w:pPr>
       <w:r>
@@ -5114,7 +5278,7 @@
         <w:pStyle w:val="Compact"/>
         <w:numPr>
           <w:ilvl w:val="0"/>
-          <w:numId w:val="1039"/>
+          <w:numId w:val="1040"/>
         </w:numPr>
       </w:pPr>
       <w:r>
@@ -5146,7 +5310,7 @@
         <w:pStyle w:val="Compact"/>
         <w:numPr>
           <w:ilvl w:val="0"/>
-          <w:numId w:val="1040"/>
+          <w:numId w:val="1041"/>
         </w:numPr>
       </w:pPr>
       <w:r>
@@ -5158,7 +5322,7 @@
         <w:pStyle w:val="Compact"/>
         <w:numPr>
           <w:ilvl w:val="0"/>
-          <w:numId w:val="1040"/>
+          <w:numId w:val="1041"/>
         </w:numPr>
       </w:pPr>
       <w:r>
@@ -5170,7 +5334,7 @@
         <w:pStyle w:val="Compact"/>
         <w:numPr>
           <w:ilvl w:val="0"/>
-          <w:numId w:val="1040"/>
+          <w:numId w:val="1041"/>
         </w:numPr>
       </w:pPr>
       <w:r>
@@ -5182,7 +5346,7 @@
         <w:pStyle w:val="Compact"/>
         <w:numPr>
           <w:ilvl w:val="0"/>
-          <w:numId w:val="1040"/>
+          <w:numId w:val="1041"/>
         </w:numPr>
       </w:pPr>
       <w:r>
@@ -5206,7 +5370,7 @@
         <w:pStyle w:val="Compact"/>
         <w:numPr>
           <w:ilvl w:val="0"/>
-          <w:numId w:val="1040"/>
+          <w:numId w:val="1041"/>
         </w:numPr>
       </w:pPr>
       <w:r>
@@ -5256,7 +5420,7 @@
         <w:pStyle w:val="Compact"/>
         <w:numPr>
           <w:ilvl w:val="0"/>
-          <w:numId w:val="1041"/>
+          <w:numId w:val="1042"/>
         </w:numPr>
       </w:pPr>
       <w:r>
@@ -5274,7 +5438,7 @@
         <w:pStyle w:val="Compact"/>
         <w:numPr>
           <w:ilvl w:val="0"/>
-          <w:numId w:val="1041"/>
+          <w:numId w:val="1042"/>
         </w:numPr>
       </w:pPr>
       <w:r>
@@ -5286,7 +5450,7 @@
         <w:pStyle w:val="Compact"/>
         <w:numPr>
           <w:ilvl w:val="0"/>
-          <w:numId w:val="1041"/>
+          <w:numId w:val="1042"/>
         </w:numPr>
       </w:pPr>
       <w:r>
@@ -5298,7 +5462,7 @@
         <w:pStyle w:val="Compact"/>
         <w:numPr>
           <w:ilvl w:val="0"/>
-          <w:numId w:val="1041"/>
+          <w:numId w:val="1042"/>
         </w:numPr>
       </w:pPr>
       <w:r>
@@ -5310,7 +5474,7 @@
         <w:pStyle w:val="Compact"/>
         <w:numPr>
           <w:ilvl w:val="0"/>
-          <w:numId w:val="1042"/>
+          <w:numId w:val="1043"/>
         </w:numPr>
       </w:pPr>
       <w:r>
@@ -5322,7 +5486,7 @@
         <w:pStyle w:val="Compact"/>
         <w:numPr>
           <w:ilvl w:val="0"/>
-          <w:numId w:val="1042"/>
+          <w:numId w:val="1043"/>
         </w:numPr>
       </w:pPr>
       <w:r>
@@ -5360,7 +5524,7 @@
         <w:pStyle w:val="Compact"/>
         <w:numPr>
           <w:ilvl w:val="0"/>
-          <w:numId w:val="1043"/>
+          <w:numId w:val="1044"/>
         </w:numPr>
       </w:pPr>
       <w:r>
@@ -5467,7 +5631,7 @@
         <w:pStyle w:val="Compact"/>
         <w:numPr>
           <w:ilvl w:val="0"/>
-          <w:numId w:val="1044"/>
+          <w:numId w:val="1045"/>
         </w:numPr>
       </w:pPr>
       <w:r>
@@ -5479,7 +5643,7 @@
         <w:pStyle w:val="Compact"/>
         <w:numPr>
           <w:ilvl w:val="0"/>
-          <w:numId w:val="1044"/>
+          <w:numId w:val="1045"/>
         </w:numPr>
       </w:pPr>
       <w:r>
@@ -5508,7 +5672,7 @@
         <w:pStyle w:val="Compact"/>
         <w:numPr>
           <w:ilvl w:val="0"/>
-          <w:numId w:val="1045"/>
+          <w:numId w:val="1046"/>
         </w:numPr>
       </w:pPr>
       <w:r>
@@ -5530,7 +5694,7 @@
         <w:pStyle w:val="Compact"/>
         <w:numPr>
           <w:ilvl w:val="0"/>
-          <w:numId w:val="1045"/>
+          <w:numId w:val="1046"/>
         </w:numPr>
       </w:pPr>
       <w:r>
@@ -5552,7 +5716,7 @@
         <w:pStyle w:val="Compact"/>
         <w:numPr>
           <w:ilvl w:val="0"/>
-          <w:numId w:val="1045"/>
+          <w:numId w:val="1046"/>
         </w:numPr>
       </w:pPr>
       <w:r>
@@ -5620,7 +5784,7 @@
         <w:pStyle w:val="Compact"/>
         <w:numPr>
           <w:ilvl w:val="0"/>
-          <w:numId w:val="1046"/>
+          <w:numId w:val="1047"/>
         </w:numPr>
       </w:pPr>
       <w:r>
@@ -5632,7 +5796,7 @@
         <w:pStyle w:val="Compact"/>
         <w:numPr>
           <w:ilvl w:val="0"/>
-          <w:numId w:val="1046"/>
+          <w:numId w:val="1047"/>
         </w:numPr>
       </w:pPr>
       <w:r>
@@ -5727,7 +5891,7 @@
         <w:pStyle w:val="Compact"/>
         <w:numPr>
           <w:ilvl w:val="0"/>
-          <w:numId w:val="1047"/>
+          <w:numId w:val="1048"/>
         </w:numPr>
       </w:pPr>
       <w:r>
@@ -5739,7 +5903,7 @@
         <w:pStyle w:val="Compact"/>
         <w:numPr>
           <w:ilvl w:val="0"/>
-          <w:numId w:val="1047"/>
+          <w:numId w:val="1048"/>
         </w:numPr>
       </w:pPr>
       <w:r>
@@ -5768,7 +5932,7 @@
         <w:pStyle w:val="Compact"/>
         <w:numPr>
           <w:ilvl w:val="0"/>
-          <w:numId w:val="1048"/>
+          <w:numId w:val="1049"/>
         </w:numPr>
       </w:pPr>
       <w:r>
@@ -5790,7 +5954,7 @@
         <w:pStyle w:val="Compact"/>
         <w:numPr>
           <w:ilvl w:val="0"/>
-          <w:numId w:val="1048"/>
+          <w:numId w:val="1049"/>
         </w:numPr>
       </w:pPr>
       <w:r>
@@ -5812,7 +5976,7 @@
         <w:pStyle w:val="Compact"/>
         <w:numPr>
           <w:ilvl w:val="0"/>
-          <w:numId w:val="1048"/>
+          <w:numId w:val="1049"/>
         </w:numPr>
       </w:pPr>
       <w:r>
@@ -5834,7 +5998,7 @@
         <w:pStyle w:val="Compact"/>
         <w:numPr>
           <w:ilvl w:val="0"/>
-          <w:numId w:val="1048"/>
+          <w:numId w:val="1049"/>
         </w:numPr>
       </w:pPr>
       <w:r>
@@ -5856,7 +6020,7 @@
         <w:pStyle w:val="Compact"/>
         <w:numPr>
           <w:ilvl w:val="0"/>
-          <w:numId w:val="1048"/>
+          <w:numId w:val="1049"/>
         </w:numPr>
       </w:pPr>
       <w:r>
@@ -5878,7 +6042,7 @@
         <w:pStyle w:val="Compact"/>
         <w:numPr>
           <w:ilvl w:val="0"/>
-          <w:numId w:val="1049"/>
+          <w:numId w:val="1050"/>
         </w:numPr>
       </w:pPr>
       <w:r>
@@ -5890,7 +6054,7 @@
         <w:pStyle w:val="Compact"/>
         <w:numPr>
           <w:ilvl w:val="0"/>
-          <w:numId w:val="1049"/>
+          <w:numId w:val="1050"/>
         </w:numPr>
       </w:pPr>
       <w:r>
@@ -6259,6 +6423,9 @@
     <w:abstractNumId w:val="991"/>
   </w:num>
   <w:num w:numId="1049">
+    <w:abstractNumId w:val="991"/>
+  </w:num>
+  <w:num w:numId="1050">
     <w:abstractNumId w:val="991"/>
   </w:num>
 </w:numbering>

</xml_diff>